<commit_message>
results exportieren und Nachkommastellen
</commit_message>
<xml_diff>
--- a/assets/User Manual word.docx
+++ b/assets/User Manual word.docx
@@ -1,32 +1,1543 @@
 
 <file path=word/document.xml><?xml version="1.0" encoding="utf-8"?>
-<w:document xmlns:wpc="http://schemas.microsoft.com/office/word/2010/wordprocessingCanvas" xmlns:cx="http://schemas.microsoft.com/office/drawing/2014/chartex" xmlns:cx1="http://schemas.microsoft.com/office/drawing/2015/9/8/chartex" xmlns:cx2="http://schemas.microsoft.com/office/drawing/2015/10/21/chartex" xmlns:cx3="http://schemas.microsoft.com/office/drawing/2016/5/9/chartex" xmlns:cx4="http://schemas.microsoft.com/office/drawing/2016/5/10/chartex" xmlns:cx5="http://schemas.microsoft.com/office/drawing/2016/5/11/chartex" xmlns:cx6="http://schemas.microsoft.com/office/drawing/2016/5/12/chartex" xmlns:cx7="http://schemas.microsoft.com/office/drawing/2016/5/13/chartex" xmlns:cx8="http://schemas.microsoft.com/office/drawing/2016/5/14/chartex" xmlns:mc="http://schemas.openxmlformats.org/markup-compatibility/2006" xmlns:aink="http://schemas.microsoft.com/office/drawing/2016/ink" xmlns:am3d="http://schemas.microsoft.com/office/drawing/2017/model3d" xmlns:o="urn:schemas-microsoft-com:office:office" xmlns:oel="http://schemas.microsoft.com/office/2019/extlst" xmlns:r="http://schemas.openxmlformats.org/officeDocument/2006/relationships" xmlns:m="http://schemas.openxmlformats.org/officeDocument/2006/math" xmlns:v="urn:schemas-microsoft-com:vml" xmlns:wp14="http://schemas.microsoft.com/office/word/2010/wordprocessingDrawing" xmlns:wp="http://schemas.openxmlformats.org/drawingml/2006/wordprocessingDrawing" xmlns:w10="urn:schemas-microsoft-com:office:word" xmlns:w="http://schemas.openxmlformats.org/wordprocessingml/2006/main" xmlns:w14="http://schemas.microsoft.com/office/word/2010/wordml" xmlns:w15="http://schemas.microsoft.com/office/word/2012/wordml" xmlns:w16cex="http://schemas.microsoft.com/office/word/2018/wordml/cex" xmlns:w16cid="http://schemas.microsoft.com/office/word/2016/wordml/cid" xmlns:w16="http://schemas.microsoft.com/office/word/2018/wordml" xmlns:w16du="http://schemas.microsoft.com/office/word/2023/wordml/word16du" xmlns:w16sdtdh="http://schemas.microsoft.com/office/word/2020/wordml/sdtdatahash" xmlns:w16sdtfl="http://schemas.microsoft.com/office/word/2024/wordml/sdtformatlock" xmlns:w16se="http://schemas.microsoft.com/office/word/2015/wordml/symex" xmlns:wpg="http://schemas.microsoft.com/office/word/2010/wordprocessingGroup" xmlns:wpi="http://schemas.microsoft.com/office/word/2010/wordprocessingInk" xmlns:wne="http://schemas.microsoft.com/office/word/2006/wordml" xmlns:wps="http://schemas.microsoft.com/office/word/2010/wordprocessingShape" mc:Ignorable="w14 w15 w16se w16cid w16 w16cex w16sdtdh w16sdtfl w16du wp14">
+<w:document xmlns:wpc="http://schemas.microsoft.com/office/word/2010/wordprocessingCanvas" xmlns:cx="http://schemas.microsoft.com/office/drawing/2014/chartex" xmlns:cx1="http://schemas.microsoft.com/office/drawing/2015/9/8/chartex" xmlns:cx2="http://schemas.microsoft.com/office/drawing/2015/10/21/chartex" xmlns:cx3="http://schemas.microsoft.com/office/drawing/2016/5/9/chartex" xmlns:cx4="http://schemas.microsoft.com/office/drawing/2016/5/10/chartex" xmlns:cx5="http://schemas.microsoft.com/office/drawing/2016/5/11/chartex" xmlns:cx6="http://schemas.microsoft.com/office/drawing/2016/5/12/chartex" xmlns:cx7="http://schemas.microsoft.com/office/drawing/2016/5/13/chartex" xmlns:cx8="http://schemas.microsoft.com/office/drawing/2016/5/14/chartex" xmlns:mc="http://schemas.openxmlformats.org/markup-compatibility/2006" xmlns:aink="http://schemas.microsoft.com/office/drawing/2016/ink" xmlns:am3d="http://schemas.microsoft.com/office/drawing/2017/model3d" xmlns:o="urn:schemas-microsoft-com:office:office" xmlns:oel="http://schemas.microsoft.com/office/2019/extlst" xmlns:r="http://schemas.openxmlformats.org/officeDocument/2006/relationships" xmlns:m="http://schemas.openxmlformats.org/officeDocument/2006/math" xmlns:v="urn:schemas-microsoft-com:vml" xmlns:wp14="http://schemas.microsoft.com/office/word/2010/wordprocessingDrawing" xmlns:wp="http://schemas.openxmlformats.org/drawingml/2006/wordprocessingDrawing" xmlns:w10="urn:schemas-microsoft-com:office:word" xmlns:w="http://schemas.openxmlformats.org/wordprocessingml/2006/main" xmlns:w14="http://schemas.microsoft.com/office/word/2010/wordml" xmlns:w15="http://schemas.microsoft.com/office/word/2012/wordml" xmlns:w16cei="http://schemas.microsoft.com/office/word/2026/wordml/cei" xmlns:w16cex="http://schemas.microsoft.com/office/word/2018/wordml/cex" xmlns:w16cid="http://schemas.microsoft.com/office/word/2016/wordml/cid" xmlns:w16="http://schemas.microsoft.com/office/word/2018/wordml" xmlns:w16du="http://schemas.microsoft.com/office/word/2023/wordml/word16du" xmlns:w16sdtdh="http://schemas.microsoft.com/office/word/2020/wordml/sdtdatahash" xmlns:w16sdtfl="http://schemas.microsoft.com/office/word/2024/wordml/sdtformatlock" xmlns:w16se="http://schemas.microsoft.com/office/word/2015/wordml/symex" xmlns:wpg="http://schemas.microsoft.com/office/word/2010/wordprocessingGroup" xmlns:wpi="http://schemas.microsoft.com/office/word/2010/wordprocessingInk" xmlns:wne="http://schemas.microsoft.com/office/word/2006/wordml" xmlns:wps="http://schemas.microsoft.com/office/word/2010/wordprocessingShape" mc:Ignorable="w14 w15 w16se w16cid w16 w16cex w16sdtdh w16sdtfl w16du wp14">
   <w:body>
     <w:p>
       <w:pPr>
+        <w:pStyle w:val="Formatvorlageusermanual"/>
         <w:jc w:val="center"/>
         <w:rPr>
-          <w:lang w:val="de-DE"/>
-        </w:rPr>
-      </w:pPr>
-      <w:r>
-        <w:rPr>
-          <w:lang w:val="de-DE"/>
+          <w:b/>
+          <w:bCs/>
+          <w:sz w:val="36"/>
+          <w:szCs w:val="36"/>
+        </w:rPr>
+      </w:pPr>
+      <w:r>
+        <w:rPr>
+          <w:b/>
+          <w:bCs/>
+          <w:sz w:val="36"/>
+          <w:szCs w:val="36"/>
+        </w:rPr>
+        <w:t xml:space="preserve">Balancing Tool </w:t>
+      </w:r>
+      <w:r>
+        <w:rPr>
+          <w:b/>
+          <w:bCs/>
+          <w:sz w:val="36"/>
+          <w:szCs w:val="36"/>
         </w:rPr>
         <w:t>User Manual</w:t>
+      </w:r>
+    </w:p>
+    <w:sdt>
+      <w:sdtPr>
+        <w:rPr>
+          <w:rFonts w:ascii="INNIO" w:eastAsiaTheme="minorHAnsi" w:hAnsi="INNIO" w:cstheme="minorBidi"/>
+          <w:color w:val="auto"/>
+          <w:kern w:val="2"/>
+          <w:sz w:val="24"/>
+          <w:szCs w:val="24"/>
+          <w:lang w:val="en-US" w:eastAsia="en-US"/>
+          <w14:ligatures w14:val="standardContextual"/>
+        </w:rPr>
+        <w:id w:val="574008846"/>
+        <w:docPartObj>
+          <w:docPartGallery w:val="Table of Contents"/>
+          <w:docPartUnique/>
+        </w:docPartObj>
+      </w:sdtPr>
+      <w:sdtEndPr>
+        <w:rPr>
+          <w:b/>
+          <w:bCs/>
+        </w:rPr>
+      </w:sdtEndPr>
+      <w:sdtContent>
+        <w:p>
+          <w:pPr>
+            <w:pStyle w:val="Inhaltsverzeichnisberschrift"/>
+            <w:rPr>
+              <w:rFonts w:ascii="INNIO" w:hAnsi="INNIO"/>
+              <w:lang w:val="en-US"/>
+            </w:rPr>
+          </w:pPr>
+          <w:r>
+            <w:rPr>
+              <w:rFonts w:ascii="INNIO" w:hAnsi="INNIO"/>
+              <w:lang w:val="en-US"/>
+            </w:rPr>
+            <w:t>Contents</w:t>
+          </w:r>
+        </w:p>
+        <w:p>
+          <w:pPr>
+            <w:pStyle w:val="Verzeichnis1"/>
+            <w:tabs>
+              <w:tab w:val="left" w:pos="480"/>
+              <w:tab w:val="right" w:leader="dot" w:pos="9062"/>
+            </w:tabs>
+            <w:rPr>
+              <w:rFonts w:eastAsiaTheme="minorEastAsia"/>
+              <w:noProof/>
+              <w:lang w:val="de-AT" w:eastAsia="de-AT"/>
+            </w:rPr>
+          </w:pPr>
+          <w:r>
+            <w:rPr>
+              <w:rFonts w:ascii="INNIO" w:hAnsi="INNIO"/>
+            </w:rPr>
+            <w:fldChar w:fldCharType="begin"/>
+          </w:r>
+          <w:r>
+            <w:rPr>
+              <w:rFonts w:ascii="INNIO" w:hAnsi="INNIO"/>
+            </w:rPr>
+            <w:instrText xml:space="preserve"> TOC \o "1-3" \h \z \u </w:instrText>
+          </w:r>
+          <w:r>
+            <w:rPr>
+              <w:rFonts w:ascii="INNIO" w:hAnsi="INNIO"/>
+            </w:rPr>
+            <w:fldChar w:fldCharType="separate"/>
+          </w:r>
+          <w:hyperlink w:anchor="_Toc237530163" w:history="1">
+            <w:r>
+              <w:rPr>
+                <w:rStyle w:val="Hyperlink"/>
+                <w:rFonts w:ascii="INNIO" w:hAnsi="INNIO"/>
+                <w:b/>
+                <w:bCs/>
+                <w:noProof/>
+              </w:rPr>
+              <w:t>1.</w:t>
+            </w:r>
+            <w:r>
+              <w:rPr>
+                <w:rFonts w:eastAsiaTheme="minorEastAsia"/>
+                <w:noProof/>
+                <w:lang w:val="de-AT" w:eastAsia="de-AT"/>
+              </w:rPr>
+              <w:tab/>
+            </w:r>
+            <w:r>
+              <w:rPr>
+                <w:rStyle w:val="Hyperlink"/>
+                <w:rFonts w:ascii="INNIO" w:hAnsi="INNIO"/>
+                <w:b/>
+                <w:bCs/>
+                <w:noProof/>
+              </w:rPr>
+              <w:t>Introduction</w:t>
+            </w:r>
+            <w:r>
+              <w:rPr>
+                <w:noProof/>
+                <w:webHidden/>
+              </w:rPr>
+              <w:tab/>
+            </w:r>
+            <w:r>
+              <w:rPr>
+                <w:noProof/>
+                <w:webHidden/>
+              </w:rPr>
+              <w:fldChar w:fldCharType="begin"/>
+            </w:r>
+            <w:r>
+              <w:rPr>
+                <w:noProof/>
+                <w:webHidden/>
+              </w:rPr>
+              <w:instrText xml:space="preserve"> PAGEREF _Toc237530163 \h </w:instrText>
+            </w:r>
+            <w:r>
+              <w:rPr>
+                <w:noProof/>
+                <w:webHidden/>
+              </w:rPr>
+            </w:r>
+            <w:r>
+              <w:rPr>
+                <w:noProof/>
+                <w:webHidden/>
+              </w:rPr>
+              <w:fldChar w:fldCharType="separate"/>
+            </w:r>
+            <w:r>
+              <w:rPr>
+                <w:noProof/>
+                <w:webHidden/>
+              </w:rPr>
+              <w:t>2</w:t>
+            </w:r>
+            <w:r>
+              <w:rPr>
+                <w:noProof/>
+                <w:webHidden/>
+              </w:rPr>
+              <w:fldChar w:fldCharType="end"/>
+            </w:r>
+          </w:hyperlink>
+        </w:p>
+        <w:p>
+          <w:pPr>
+            <w:pStyle w:val="Verzeichnis1"/>
+            <w:tabs>
+              <w:tab w:val="left" w:pos="480"/>
+              <w:tab w:val="right" w:leader="dot" w:pos="9062"/>
+            </w:tabs>
+            <w:rPr>
+              <w:rFonts w:eastAsiaTheme="minorEastAsia"/>
+              <w:noProof/>
+              <w:lang w:val="de-AT" w:eastAsia="de-AT"/>
+            </w:rPr>
+          </w:pPr>
+          <w:hyperlink w:anchor="_Toc237530164" w:history="1">
+            <w:r>
+              <w:rPr>
+                <w:rStyle w:val="Hyperlink"/>
+                <w:rFonts w:ascii="INNIO" w:hAnsi="INNIO"/>
+                <w:b/>
+                <w:bCs/>
+                <w:noProof/>
+              </w:rPr>
+              <w:t>2.</w:t>
+            </w:r>
+            <w:r>
+              <w:rPr>
+                <w:rFonts w:eastAsiaTheme="minorEastAsia"/>
+                <w:noProof/>
+                <w:lang w:val="de-AT" w:eastAsia="de-AT"/>
+              </w:rPr>
+              <w:tab/>
+            </w:r>
+            <w:r>
+              <w:rPr>
+                <w:rStyle w:val="Hyperlink"/>
+                <w:rFonts w:ascii="INNIO" w:hAnsi="INNIO"/>
+                <w:b/>
+                <w:bCs/>
+                <w:noProof/>
+              </w:rPr>
+              <w:t>Required Input File</w:t>
+            </w:r>
+            <w:r>
+              <w:rPr>
+                <w:noProof/>
+                <w:webHidden/>
+              </w:rPr>
+              <w:tab/>
+            </w:r>
+            <w:r>
+              <w:rPr>
+                <w:noProof/>
+                <w:webHidden/>
+              </w:rPr>
+              <w:fldChar w:fldCharType="begin"/>
+            </w:r>
+            <w:r>
+              <w:rPr>
+                <w:noProof/>
+                <w:webHidden/>
+              </w:rPr>
+              <w:instrText xml:space="preserve"> PAGEREF _Toc237530164 \h </w:instrText>
+            </w:r>
+            <w:r>
+              <w:rPr>
+                <w:noProof/>
+                <w:webHidden/>
+              </w:rPr>
+            </w:r>
+            <w:r>
+              <w:rPr>
+                <w:noProof/>
+                <w:webHidden/>
+              </w:rPr>
+              <w:fldChar w:fldCharType="separate"/>
+            </w:r>
+            <w:r>
+              <w:rPr>
+                <w:noProof/>
+                <w:webHidden/>
+              </w:rPr>
+              <w:t>2</w:t>
+            </w:r>
+            <w:r>
+              <w:rPr>
+                <w:noProof/>
+                <w:webHidden/>
+              </w:rPr>
+              <w:fldChar w:fldCharType="end"/>
+            </w:r>
+          </w:hyperlink>
+        </w:p>
+        <w:p>
+          <w:pPr>
+            <w:pStyle w:val="Verzeichnis2"/>
+            <w:tabs>
+              <w:tab w:val="left" w:pos="960"/>
+              <w:tab w:val="right" w:leader="dot" w:pos="9062"/>
+            </w:tabs>
+            <w:rPr>
+              <w:rFonts w:eastAsiaTheme="minorEastAsia"/>
+              <w:noProof/>
+              <w:lang w:val="de-AT" w:eastAsia="de-AT"/>
+            </w:rPr>
+          </w:pPr>
+          <w:hyperlink w:anchor="_Toc237530165" w:history="1">
+            <w:r>
+              <w:rPr>
+                <w:rStyle w:val="Hyperlink"/>
+                <w:rFonts w:ascii="INNIO" w:hAnsi="INNIO"/>
+                <w:b/>
+                <w:bCs/>
+                <w:noProof/>
+              </w:rPr>
+              <w:t>2.1.</w:t>
+            </w:r>
+            <w:r>
+              <w:rPr>
+                <w:rFonts w:eastAsiaTheme="minorEastAsia"/>
+                <w:noProof/>
+                <w:lang w:val="de-AT" w:eastAsia="de-AT"/>
+              </w:rPr>
+              <w:tab/>
+            </w:r>
+            <w:r>
+              <w:rPr>
+                <w:rStyle w:val="Hyperlink"/>
+                <w:rFonts w:ascii="INNIO" w:hAnsi="INNIO"/>
+                <w:b/>
+                <w:bCs/>
+                <w:noProof/>
+              </w:rPr>
+              <w:t>Table 1- Engine configuration</w:t>
+            </w:r>
+            <w:r>
+              <w:rPr>
+                <w:noProof/>
+                <w:webHidden/>
+              </w:rPr>
+              <w:tab/>
+            </w:r>
+            <w:r>
+              <w:rPr>
+                <w:noProof/>
+                <w:webHidden/>
+              </w:rPr>
+              <w:fldChar w:fldCharType="begin"/>
+            </w:r>
+            <w:r>
+              <w:rPr>
+                <w:noProof/>
+                <w:webHidden/>
+              </w:rPr>
+              <w:instrText xml:space="preserve"> PAGEREF _Toc237530165 \h </w:instrText>
+            </w:r>
+            <w:r>
+              <w:rPr>
+                <w:noProof/>
+                <w:webHidden/>
+              </w:rPr>
+            </w:r>
+            <w:r>
+              <w:rPr>
+                <w:noProof/>
+                <w:webHidden/>
+              </w:rPr>
+              <w:fldChar w:fldCharType="separate"/>
+            </w:r>
+            <w:r>
+              <w:rPr>
+                <w:noProof/>
+                <w:webHidden/>
+              </w:rPr>
+              <w:t>2</w:t>
+            </w:r>
+            <w:r>
+              <w:rPr>
+                <w:noProof/>
+                <w:webHidden/>
+              </w:rPr>
+              <w:fldChar w:fldCharType="end"/>
+            </w:r>
+          </w:hyperlink>
+        </w:p>
+        <w:p>
+          <w:pPr>
+            <w:pStyle w:val="Verzeichnis2"/>
+            <w:tabs>
+              <w:tab w:val="left" w:pos="960"/>
+              <w:tab w:val="right" w:leader="dot" w:pos="9062"/>
+            </w:tabs>
+            <w:rPr>
+              <w:rFonts w:eastAsiaTheme="minorEastAsia"/>
+              <w:noProof/>
+              <w:lang w:val="de-AT" w:eastAsia="de-AT"/>
+            </w:rPr>
+          </w:pPr>
+          <w:hyperlink w:anchor="_Toc237530166" w:history="1">
+            <w:r>
+              <w:rPr>
+                <w:rStyle w:val="Hyperlink"/>
+                <w:rFonts w:ascii="INNIO" w:hAnsi="INNIO"/>
+                <w:b/>
+                <w:bCs/>
+                <w:noProof/>
+              </w:rPr>
+              <w:t>2.2.</w:t>
+            </w:r>
+            <w:r>
+              <w:rPr>
+                <w:rFonts w:eastAsiaTheme="minorEastAsia"/>
+                <w:noProof/>
+                <w:lang w:val="de-AT" w:eastAsia="de-AT"/>
+              </w:rPr>
+              <w:tab/>
+            </w:r>
+            <w:r>
+              <w:rPr>
+                <w:rStyle w:val="Hyperlink"/>
+                <w:rFonts w:ascii="INNIO" w:hAnsi="INNIO"/>
+                <w:b/>
+                <w:bCs/>
+                <w:noProof/>
+              </w:rPr>
+              <w:t>Table 2- Crankshaft geometry</w:t>
+            </w:r>
+            <w:r>
+              <w:rPr>
+                <w:noProof/>
+                <w:webHidden/>
+              </w:rPr>
+              <w:tab/>
+            </w:r>
+            <w:r>
+              <w:rPr>
+                <w:noProof/>
+                <w:webHidden/>
+              </w:rPr>
+              <w:fldChar w:fldCharType="begin"/>
+            </w:r>
+            <w:r>
+              <w:rPr>
+                <w:noProof/>
+                <w:webHidden/>
+              </w:rPr>
+              <w:instrText xml:space="preserve"> PAGEREF _Toc237530166 \h </w:instrText>
+            </w:r>
+            <w:r>
+              <w:rPr>
+                <w:noProof/>
+                <w:webHidden/>
+              </w:rPr>
+            </w:r>
+            <w:r>
+              <w:rPr>
+                <w:noProof/>
+                <w:webHidden/>
+              </w:rPr>
+              <w:fldChar w:fldCharType="separate"/>
+            </w:r>
+            <w:r>
+              <w:rPr>
+                <w:noProof/>
+                <w:webHidden/>
+              </w:rPr>
+              <w:t>2</w:t>
+            </w:r>
+            <w:r>
+              <w:rPr>
+                <w:noProof/>
+                <w:webHidden/>
+              </w:rPr>
+              <w:fldChar w:fldCharType="end"/>
+            </w:r>
+          </w:hyperlink>
+        </w:p>
+        <w:p>
+          <w:pPr>
+            <w:pStyle w:val="Verzeichnis2"/>
+            <w:tabs>
+              <w:tab w:val="left" w:pos="960"/>
+              <w:tab w:val="right" w:leader="dot" w:pos="9062"/>
+            </w:tabs>
+            <w:rPr>
+              <w:rFonts w:eastAsiaTheme="minorEastAsia"/>
+              <w:noProof/>
+              <w:lang w:val="de-AT" w:eastAsia="de-AT"/>
+            </w:rPr>
+          </w:pPr>
+          <w:hyperlink w:anchor="_Toc237530167" w:history="1">
+            <w:r>
+              <w:rPr>
+                <w:rStyle w:val="Hyperlink"/>
+                <w:rFonts w:ascii="INNIO" w:hAnsi="INNIO"/>
+                <w:b/>
+                <w:bCs/>
+                <w:noProof/>
+              </w:rPr>
+              <w:t>2.3.</w:t>
+            </w:r>
+            <w:r>
+              <w:rPr>
+                <w:rFonts w:eastAsiaTheme="minorEastAsia"/>
+                <w:noProof/>
+                <w:lang w:val="de-AT" w:eastAsia="de-AT"/>
+              </w:rPr>
+              <w:tab/>
+            </w:r>
+            <w:r>
+              <w:rPr>
+                <w:rStyle w:val="Hyperlink"/>
+                <w:rFonts w:ascii="INNIO" w:hAnsi="INNIO"/>
+                <w:b/>
+                <w:bCs/>
+                <w:noProof/>
+              </w:rPr>
+              <w:t>Table 3- Rotating and oscillating masses</w:t>
+            </w:r>
+            <w:r>
+              <w:rPr>
+                <w:noProof/>
+                <w:webHidden/>
+              </w:rPr>
+              <w:tab/>
+            </w:r>
+            <w:r>
+              <w:rPr>
+                <w:noProof/>
+                <w:webHidden/>
+              </w:rPr>
+              <w:fldChar w:fldCharType="begin"/>
+            </w:r>
+            <w:r>
+              <w:rPr>
+                <w:noProof/>
+                <w:webHidden/>
+              </w:rPr>
+              <w:instrText xml:space="preserve"> PAGEREF _Toc237530167 \h </w:instrText>
+            </w:r>
+            <w:r>
+              <w:rPr>
+                <w:noProof/>
+                <w:webHidden/>
+              </w:rPr>
+            </w:r>
+            <w:r>
+              <w:rPr>
+                <w:noProof/>
+                <w:webHidden/>
+              </w:rPr>
+              <w:fldChar w:fldCharType="separate"/>
+            </w:r>
+            <w:r>
+              <w:rPr>
+                <w:noProof/>
+                <w:webHidden/>
+              </w:rPr>
+              <w:t>3</w:t>
+            </w:r>
+            <w:r>
+              <w:rPr>
+                <w:noProof/>
+                <w:webHidden/>
+              </w:rPr>
+              <w:fldChar w:fldCharType="end"/>
+            </w:r>
+          </w:hyperlink>
+        </w:p>
+        <w:p>
+          <w:pPr>
+            <w:pStyle w:val="Verzeichnis2"/>
+            <w:tabs>
+              <w:tab w:val="left" w:pos="960"/>
+              <w:tab w:val="right" w:leader="dot" w:pos="9062"/>
+            </w:tabs>
+            <w:rPr>
+              <w:rFonts w:eastAsiaTheme="minorEastAsia"/>
+              <w:noProof/>
+              <w:lang w:val="de-AT" w:eastAsia="de-AT"/>
+            </w:rPr>
+          </w:pPr>
+          <w:hyperlink w:anchor="_Toc237530168" w:history="1">
+            <w:r>
+              <w:rPr>
+                <w:rStyle w:val="Hyperlink"/>
+                <w:rFonts w:ascii="INNIO" w:hAnsi="INNIO"/>
+                <w:b/>
+                <w:bCs/>
+                <w:noProof/>
+              </w:rPr>
+              <w:t>2.4.</w:t>
+            </w:r>
+            <w:r>
+              <w:rPr>
+                <w:rFonts w:eastAsiaTheme="minorEastAsia"/>
+                <w:noProof/>
+                <w:lang w:val="de-AT" w:eastAsia="de-AT"/>
+              </w:rPr>
+              <w:tab/>
+            </w:r>
+            <w:r>
+              <w:rPr>
+                <w:rStyle w:val="Hyperlink"/>
+                <w:rFonts w:ascii="INNIO" w:hAnsi="INNIO"/>
+                <w:b/>
+                <w:bCs/>
+                <w:noProof/>
+              </w:rPr>
+              <w:t>Table 4- Throw angles</w:t>
+            </w:r>
+            <w:r>
+              <w:rPr>
+                <w:noProof/>
+                <w:webHidden/>
+              </w:rPr>
+              <w:tab/>
+            </w:r>
+            <w:r>
+              <w:rPr>
+                <w:noProof/>
+                <w:webHidden/>
+              </w:rPr>
+              <w:fldChar w:fldCharType="begin"/>
+            </w:r>
+            <w:r>
+              <w:rPr>
+                <w:noProof/>
+                <w:webHidden/>
+              </w:rPr>
+              <w:instrText xml:space="preserve"> PAGEREF _Toc237530168 \h </w:instrText>
+            </w:r>
+            <w:r>
+              <w:rPr>
+                <w:noProof/>
+                <w:webHidden/>
+              </w:rPr>
+            </w:r>
+            <w:r>
+              <w:rPr>
+                <w:noProof/>
+                <w:webHidden/>
+              </w:rPr>
+              <w:fldChar w:fldCharType="separate"/>
+            </w:r>
+            <w:r>
+              <w:rPr>
+                <w:noProof/>
+                <w:webHidden/>
+              </w:rPr>
+              <w:t>3</w:t>
+            </w:r>
+            <w:r>
+              <w:rPr>
+                <w:noProof/>
+                <w:webHidden/>
+              </w:rPr>
+              <w:fldChar w:fldCharType="end"/>
+            </w:r>
+          </w:hyperlink>
+        </w:p>
+        <w:p>
+          <w:pPr>
+            <w:pStyle w:val="Verzeichnis1"/>
+            <w:tabs>
+              <w:tab w:val="left" w:pos="480"/>
+              <w:tab w:val="right" w:leader="dot" w:pos="9062"/>
+            </w:tabs>
+            <w:rPr>
+              <w:rFonts w:eastAsiaTheme="minorEastAsia"/>
+              <w:noProof/>
+              <w:lang w:val="de-AT" w:eastAsia="de-AT"/>
+            </w:rPr>
+          </w:pPr>
+          <w:hyperlink w:anchor="_Toc237530169" w:history="1">
+            <w:r>
+              <w:rPr>
+                <w:rStyle w:val="Hyperlink"/>
+                <w:rFonts w:ascii="INNIO" w:hAnsi="INNIO"/>
+                <w:b/>
+                <w:bCs/>
+                <w:noProof/>
+              </w:rPr>
+              <w:t>3.</w:t>
+            </w:r>
+            <w:r>
+              <w:rPr>
+                <w:rFonts w:eastAsiaTheme="minorEastAsia"/>
+                <w:noProof/>
+                <w:lang w:val="de-AT" w:eastAsia="de-AT"/>
+              </w:rPr>
+              <w:tab/>
+            </w:r>
+            <w:r>
+              <w:rPr>
+                <w:rStyle w:val="Hyperlink"/>
+                <w:rFonts w:ascii="INNIO" w:hAnsi="INNIO"/>
+                <w:b/>
+                <w:bCs/>
+                <w:noProof/>
+              </w:rPr>
+              <w:t>How to Use the Tool</w:t>
+            </w:r>
+            <w:r>
+              <w:rPr>
+                <w:noProof/>
+                <w:webHidden/>
+              </w:rPr>
+              <w:tab/>
+            </w:r>
+            <w:r>
+              <w:rPr>
+                <w:noProof/>
+                <w:webHidden/>
+              </w:rPr>
+              <w:fldChar w:fldCharType="begin"/>
+            </w:r>
+            <w:r>
+              <w:rPr>
+                <w:noProof/>
+                <w:webHidden/>
+              </w:rPr>
+              <w:instrText xml:space="preserve"> PAGEREF _Toc237530169 \h </w:instrText>
+            </w:r>
+            <w:r>
+              <w:rPr>
+                <w:noProof/>
+                <w:webHidden/>
+              </w:rPr>
+            </w:r>
+            <w:r>
+              <w:rPr>
+                <w:noProof/>
+                <w:webHidden/>
+              </w:rPr>
+              <w:fldChar w:fldCharType="separate"/>
+            </w:r>
+            <w:r>
+              <w:rPr>
+                <w:noProof/>
+                <w:webHidden/>
+              </w:rPr>
+              <w:t>3</w:t>
+            </w:r>
+            <w:r>
+              <w:rPr>
+                <w:noProof/>
+                <w:webHidden/>
+              </w:rPr>
+              <w:fldChar w:fldCharType="end"/>
+            </w:r>
+          </w:hyperlink>
+        </w:p>
+        <w:p>
+          <w:pPr>
+            <w:pStyle w:val="Verzeichnis1"/>
+            <w:tabs>
+              <w:tab w:val="left" w:pos="480"/>
+              <w:tab w:val="right" w:leader="dot" w:pos="9062"/>
+            </w:tabs>
+            <w:rPr>
+              <w:rFonts w:eastAsiaTheme="minorEastAsia"/>
+              <w:noProof/>
+              <w:lang w:val="de-AT" w:eastAsia="de-AT"/>
+            </w:rPr>
+          </w:pPr>
+          <w:hyperlink w:anchor="_Toc237530170" w:history="1">
+            <w:r>
+              <w:rPr>
+                <w:rStyle w:val="Hyperlink"/>
+                <w:rFonts w:ascii="INNIO" w:hAnsi="INNIO"/>
+                <w:b/>
+                <w:bCs/>
+                <w:noProof/>
+              </w:rPr>
+              <w:t>4.</w:t>
+            </w:r>
+            <w:r>
+              <w:rPr>
+                <w:rFonts w:eastAsiaTheme="minorEastAsia"/>
+                <w:noProof/>
+                <w:lang w:val="de-AT" w:eastAsia="de-AT"/>
+              </w:rPr>
+              <w:tab/>
+            </w:r>
+            <w:r>
+              <w:rPr>
+                <w:rStyle w:val="Hyperlink"/>
+                <w:rFonts w:ascii="INNIO" w:hAnsi="INNIO"/>
+                <w:b/>
+                <w:bCs/>
+                <w:noProof/>
+              </w:rPr>
+              <w:t>Results an Calculation</w:t>
+            </w:r>
+            <w:r>
+              <w:rPr>
+                <w:noProof/>
+                <w:webHidden/>
+              </w:rPr>
+              <w:tab/>
+            </w:r>
+            <w:r>
+              <w:rPr>
+                <w:noProof/>
+                <w:webHidden/>
+              </w:rPr>
+              <w:fldChar w:fldCharType="begin"/>
+            </w:r>
+            <w:r>
+              <w:rPr>
+                <w:noProof/>
+                <w:webHidden/>
+              </w:rPr>
+              <w:instrText xml:space="preserve"> PAGEREF _Toc237530170 \h </w:instrText>
+            </w:r>
+            <w:r>
+              <w:rPr>
+                <w:noProof/>
+                <w:webHidden/>
+              </w:rPr>
+            </w:r>
+            <w:r>
+              <w:rPr>
+                <w:noProof/>
+                <w:webHidden/>
+              </w:rPr>
+              <w:fldChar w:fldCharType="separate"/>
+            </w:r>
+            <w:r>
+              <w:rPr>
+                <w:noProof/>
+                <w:webHidden/>
+              </w:rPr>
+              <w:t>4</w:t>
+            </w:r>
+            <w:r>
+              <w:rPr>
+                <w:noProof/>
+                <w:webHidden/>
+              </w:rPr>
+              <w:fldChar w:fldCharType="end"/>
+            </w:r>
+          </w:hyperlink>
+        </w:p>
+        <w:p>
+          <w:pPr>
+            <w:rPr>
+              <w:rFonts w:ascii="INNIO" w:hAnsi="INNIO"/>
+            </w:rPr>
+          </w:pPr>
+          <w:r>
+            <w:rPr>
+              <w:rFonts w:ascii="INNIO" w:hAnsi="INNIO"/>
+              <w:b/>
+              <w:bCs/>
+            </w:rPr>
+            <w:fldChar w:fldCharType="end"/>
+          </w:r>
+        </w:p>
+      </w:sdtContent>
+    </w:sdt>
+    <w:p>
+      <w:pPr>
+        <w:rPr>
+          <w:rFonts w:ascii="INNIO" w:hAnsi="INNIO"/>
+        </w:rPr>
+      </w:pPr>
+      <w:r>
+        <w:br w:type="page"/>
       </w:r>
     </w:p>
     <w:p>
       <w:pPr>
-        <w:rPr>
-          <w:lang w:val="de-DE"/>
-        </w:rPr>
-      </w:pPr>
-      <w:r>
-        <w:rPr>
-          <w:lang w:val="de-DE"/>
-        </w:rPr>
-        <w:t>Just a Test</w:t>
+        <w:pStyle w:val="berschrift1"/>
+        <w:numPr>
+          <w:ilvl w:val="0"/>
+          <w:numId w:val="1"/>
+        </w:numPr>
+        <w:rPr>
+          <w:rFonts w:ascii="INNIO" w:hAnsi="INNIO"/>
+          <w:b/>
+          <w:bCs/>
+          <w:color w:val="auto"/>
+          <w:sz w:val="32"/>
+          <w:szCs w:val="32"/>
+        </w:rPr>
+      </w:pPr>
+      <w:bookmarkStart w:id="0" w:name="_Toc237530163"/>
+      <w:r>
+        <w:rPr>
+          <w:rFonts w:ascii="INNIO" w:hAnsi="INNIO"/>
+          <w:b/>
+          <w:bCs/>
+          <w:color w:val="auto"/>
+          <w:sz w:val="32"/>
+          <w:szCs w:val="32"/>
+        </w:rPr>
+        <w:lastRenderedPageBreak/>
+        <w:t>Introduction</w:t>
+      </w:r>
+      <w:bookmarkEnd w:id="0"/>
+    </w:p>
+    <w:p>
+      <w:pPr>
+        <w:pStyle w:val="StandardWeb"/>
+        <w:shd w:val="clear" w:color="auto" w:fill="FFFFFF"/>
+        <w:rPr>
+          <w:rFonts w:ascii="INNIO" w:hAnsi="INNIO" w:cs="Segoe UI"/>
+          <w:lang w:val="en-US"/>
+        </w:rPr>
+      </w:pPr>
+      <w:r>
+        <w:rPr>
+          <w:rFonts w:ascii="INNIO" w:hAnsi="INNIO" w:cs="Segoe UI"/>
+          <w:lang w:val="en-US"/>
+        </w:rPr>
+        <w:t>The Balancing Tool is used to perform crankshaft balancing calculations based on a predefined Excel input file. It provides a simplified and more user-friendly interface for the existing calculation workflow. The tool reads the required engine, geometry, mass, and throw angle data from the uploaded file, executes the calculation, and displays the results in a structured format.</w:t>
+      </w:r>
+    </w:p>
+    <w:p>
+      <w:pPr>
+        <w:pStyle w:val="berschrift1"/>
+        <w:numPr>
+          <w:ilvl w:val="0"/>
+          <w:numId w:val="1"/>
+        </w:numPr>
+        <w:rPr>
+          <w:rFonts w:ascii="INNIO" w:hAnsi="INNIO"/>
+          <w:b/>
+          <w:bCs/>
+          <w:color w:val="auto"/>
+          <w:sz w:val="32"/>
+          <w:szCs w:val="32"/>
+        </w:rPr>
+      </w:pPr>
+      <w:bookmarkStart w:id="1" w:name="_Toc237530164"/>
+      <w:r>
+        <w:rPr>
+          <w:rFonts w:ascii="INNIO" w:hAnsi="INNIO"/>
+          <w:b/>
+          <w:bCs/>
+          <w:color w:val="auto"/>
+          <w:sz w:val="32"/>
+          <w:szCs w:val="32"/>
+        </w:rPr>
+        <w:t>Required Input File</w:t>
+      </w:r>
+      <w:bookmarkEnd w:id="1"/>
+    </w:p>
+    <w:p>
+      <w:pPr>
+        <w:rPr>
+          <w:rFonts w:ascii="INNIO" w:hAnsi="INNIO"/>
+        </w:rPr>
+      </w:pPr>
+      <w:r>
+        <w:rPr>
+          <w:rFonts w:ascii="INNIO" w:hAnsi="INNIO"/>
+        </w:rPr>
+        <w:t xml:space="preserve">The tool requires an Excel input file containing a sheet named “Balancing”. The sheet must include the required input tables for engine configuration, crankshaft geometry, masses, and throw angles. The overall table structure must be maintained so that the tool can read the input data correctly. </w:t>
+      </w:r>
+    </w:p>
+    <w:p>
+      <w:pPr>
+        <w:pStyle w:val="berschrift2"/>
+        <w:numPr>
+          <w:ilvl w:val="1"/>
+          <w:numId w:val="1"/>
+        </w:numPr>
+        <w:rPr>
+          <w:rFonts w:ascii="INNIO" w:hAnsi="INNIO"/>
+          <w:b/>
+          <w:bCs/>
+          <w:color w:val="auto"/>
+          <w:sz w:val="28"/>
+          <w:szCs w:val="28"/>
+        </w:rPr>
+      </w:pPr>
+      <w:bookmarkStart w:id="2" w:name="_Toc237530165"/>
+      <w:r>
+        <w:rPr>
+          <w:rFonts w:ascii="INNIO" w:hAnsi="INNIO"/>
+          <w:b/>
+          <w:bCs/>
+          <w:noProof/>
+          <w:color w:val="auto"/>
+        </w:rPr>
+        <w:drawing>
+          <wp:anchor distT="0" distB="0" distL="114300" distR="114300" simplePos="0" relativeHeight="251658240" behindDoc="1" locked="0" layoutInCell="1" allowOverlap="1" wp14:anchorId="40C083CA" wp14:editId="784FF12B">
+            <wp:simplePos x="0" y="0"/>
+            <wp:positionH relativeFrom="margin">
+              <wp:align>left</wp:align>
+            </wp:positionH>
+            <wp:positionV relativeFrom="paragraph">
+              <wp:posOffset>376555</wp:posOffset>
+            </wp:positionV>
+            <wp:extent cx="3209925" cy="1390650"/>
+            <wp:effectExtent l="0" t="0" r="9525" b="0"/>
+            <wp:wrapTopAndBottom/>
+            <wp:docPr id="1492760011" name="Grafik 1"/>
+            <wp:cNvGraphicFramePr>
+              <a:graphicFrameLocks xmlns:a="http://schemas.openxmlformats.org/drawingml/2006/main" noChangeAspect="1"/>
+            </wp:cNvGraphicFramePr>
+            <a:graphic xmlns:a="http://schemas.openxmlformats.org/drawingml/2006/main">
+              <a:graphicData uri="http://schemas.openxmlformats.org/drawingml/2006/picture">
+                <pic:pic xmlns:pic="http://schemas.openxmlformats.org/drawingml/2006/picture">
+                  <pic:nvPicPr>
+                    <pic:cNvPr id="1492760011" name=""/>
+                    <pic:cNvPicPr/>
+                  </pic:nvPicPr>
+                  <pic:blipFill>
+                    <a:blip r:embed="rId6">
+                      <a:extLst>
+                        <a:ext uri="{28A0092B-C50C-407E-A947-70E740481C1C}">
+                          <a14:useLocalDpi xmlns:a14="http://schemas.microsoft.com/office/drawing/2010/main" val="0"/>
+                        </a:ext>
+                      </a:extLst>
+                    </a:blip>
+                    <a:stretch>
+                      <a:fillRect/>
+                    </a:stretch>
+                  </pic:blipFill>
+                  <pic:spPr>
+                    <a:xfrm>
+                      <a:off x="0" y="0"/>
+                      <a:ext cx="3209925" cy="1390650"/>
+                    </a:xfrm>
+                    <a:prstGeom prst="rect">
+                      <a:avLst/>
+                    </a:prstGeom>
+                  </pic:spPr>
+                </pic:pic>
+              </a:graphicData>
+            </a:graphic>
+          </wp:anchor>
+        </w:drawing>
+      </w:r>
+      <w:r>
+        <w:rPr>
+          <w:rFonts w:ascii="INNIO" w:hAnsi="INNIO"/>
+          <w:b/>
+          <w:bCs/>
+          <w:color w:val="auto"/>
+          <w:sz w:val="28"/>
+          <w:szCs w:val="28"/>
+        </w:rPr>
+        <w:t>Table 1- Engine configuration</w:t>
+      </w:r>
+      <w:bookmarkEnd w:id="2"/>
+      <w:r>
+        <w:rPr>
+          <w:rFonts w:ascii="INNIO" w:hAnsi="INNIO"/>
+          <w:b/>
+          <w:bCs/>
+          <w:color w:val="auto"/>
+          <w:sz w:val="28"/>
+          <w:szCs w:val="28"/>
+        </w:rPr>
+        <w:t xml:space="preserve"> </w:t>
+      </w:r>
+    </w:p>
+    <w:p>
+      <w:pPr>
+        <w:rPr>
+          <w:rFonts w:ascii="INNIO" w:hAnsi="INNIO"/>
+        </w:rPr>
+      </w:pPr>
+      <w:r>
+        <w:rPr>
+          <w:rFonts w:ascii="INNIO" w:hAnsi="INNIO"/>
+        </w:rPr>
+        <w:t xml:space="preserve">Table 1 contains the basic engine configuration, including speed, number of cylinders, cylinder arrangement and vee angle. The correct units need to be included. </w:t>
+      </w:r>
+    </w:p>
+    <w:p>
+      <w:pPr>
+        <w:pStyle w:val="berschrift2"/>
+        <w:numPr>
+          <w:ilvl w:val="1"/>
+          <w:numId w:val="1"/>
+        </w:numPr>
+        <w:rPr>
+          <w:rFonts w:ascii="INNIO" w:hAnsi="INNIO"/>
+          <w:b/>
+          <w:bCs/>
+          <w:color w:val="auto"/>
+        </w:rPr>
+      </w:pPr>
+      <w:bookmarkStart w:id="3" w:name="_Toc237530166"/>
+      <w:r>
+        <w:rPr>
+          <w:rFonts w:ascii="INNIO" w:hAnsi="INNIO"/>
+          <w:b/>
+          <w:bCs/>
+          <w:noProof/>
+          <w:color w:val="auto"/>
+        </w:rPr>
+        <w:drawing>
+          <wp:anchor distT="0" distB="0" distL="114300" distR="114300" simplePos="0" relativeHeight="251659264" behindDoc="1" locked="0" layoutInCell="1" allowOverlap="1" wp14:anchorId="69CD8FED" wp14:editId="29ECD79D">
+            <wp:simplePos x="0" y="0"/>
+            <wp:positionH relativeFrom="margin">
+              <wp:align>left</wp:align>
+            </wp:positionH>
+            <wp:positionV relativeFrom="paragraph">
+              <wp:posOffset>339725</wp:posOffset>
+            </wp:positionV>
+            <wp:extent cx="4601210" cy="1819275"/>
+            <wp:effectExtent l="0" t="0" r="8890" b="9525"/>
+            <wp:wrapTopAndBottom/>
+            <wp:docPr id="1401907343" name="Grafik 1"/>
+            <wp:cNvGraphicFramePr>
+              <a:graphicFrameLocks xmlns:a="http://schemas.openxmlformats.org/drawingml/2006/main" noChangeAspect="1"/>
+            </wp:cNvGraphicFramePr>
+            <a:graphic xmlns:a="http://schemas.openxmlformats.org/drawingml/2006/main">
+              <a:graphicData uri="http://schemas.openxmlformats.org/drawingml/2006/picture">
+                <pic:pic xmlns:pic="http://schemas.openxmlformats.org/drawingml/2006/picture">
+                  <pic:nvPicPr>
+                    <pic:cNvPr id="1401907343" name=""/>
+                    <pic:cNvPicPr/>
+                  </pic:nvPicPr>
+                  <pic:blipFill>
+                    <a:blip r:embed="rId7">
+                      <a:extLst>
+                        <a:ext uri="{28A0092B-C50C-407E-A947-70E740481C1C}">
+                          <a14:useLocalDpi xmlns:a14="http://schemas.microsoft.com/office/drawing/2010/main" val="0"/>
+                        </a:ext>
+                      </a:extLst>
+                    </a:blip>
+                    <a:stretch>
+                      <a:fillRect/>
+                    </a:stretch>
+                  </pic:blipFill>
+                  <pic:spPr>
+                    <a:xfrm>
+                      <a:off x="0" y="0"/>
+                      <a:ext cx="4601210" cy="1819275"/>
+                    </a:xfrm>
+                    <a:prstGeom prst="rect">
+                      <a:avLst/>
+                    </a:prstGeom>
+                  </pic:spPr>
+                </pic:pic>
+              </a:graphicData>
+            </a:graphic>
+          </wp:anchor>
+        </w:drawing>
+      </w:r>
+      <w:r>
+        <w:rPr>
+          <w:rFonts w:ascii="INNIO" w:hAnsi="INNIO"/>
+          <w:b/>
+          <w:bCs/>
+          <w:color w:val="auto"/>
+        </w:rPr>
+        <w:t>Table 2- Crankshaft geometry</w:t>
+      </w:r>
+      <w:bookmarkEnd w:id="3"/>
+    </w:p>
+    <w:p>
+      <w:pPr>
+        <w:rPr>
+          <w:rFonts w:ascii="INNIO" w:hAnsi="INNIO"/>
+        </w:rPr>
+      </w:pPr>
+    </w:p>
+    <w:p>
+      <w:pPr>
+        <w:rPr>
+          <w:rFonts w:ascii="INNIO" w:hAnsi="INNIO"/>
+        </w:rPr>
+      </w:pPr>
+      <w:r>
+        <w:rPr>
+          <w:rFonts w:ascii="INNIO" w:hAnsi="INNIO"/>
+        </w:rPr>
+        <w:lastRenderedPageBreak/>
+        <w:t xml:space="preserve">Table 2 contains the main crankshaft geometry data required for the balancing calculation, such as stroke, conrod length, and relevant journal and cylinder distances. </w:t>
+      </w:r>
+    </w:p>
+    <w:p>
+      <w:pPr>
+        <w:pStyle w:val="berschrift2"/>
+        <w:numPr>
+          <w:ilvl w:val="1"/>
+          <w:numId w:val="1"/>
+        </w:numPr>
+        <w:rPr>
+          <w:rFonts w:ascii="INNIO" w:hAnsi="INNIO"/>
+          <w:b/>
+          <w:bCs/>
+          <w:color w:val="auto"/>
+        </w:rPr>
+      </w:pPr>
+      <w:bookmarkStart w:id="4" w:name="_Toc237530167"/>
+      <w:r>
+        <w:rPr>
+          <w:rFonts w:ascii="INNIO" w:hAnsi="INNIO"/>
+          <w:b/>
+          <w:bCs/>
+          <w:noProof/>
+          <w:color w:val="auto"/>
+        </w:rPr>
+        <w:drawing>
+          <wp:anchor distT="0" distB="0" distL="114300" distR="114300" simplePos="0" relativeHeight="251660288" behindDoc="0" locked="0" layoutInCell="1" allowOverlap="1" wp14:anchorId="2E766318" wp14:editId="111F12B6">
+            <wp:simplePos x="0" y="0"/>
+            <wp:positionH relativeFrom="margin">
+              <wp:align>left</wp:align>
+            </wp:positionH>
+            <wp:positionV relativeFrom="paragraph">
+              <wp:posOffset>347980</wp:posOffset>
+            </wp:positionV>
+            <wp:extent cx="3952875" cy="1628775"/>
+            <wp:effectExtent l="0" t="0" r="9525" b="9525"/>
+            <wp:wrapTopAndBottom/>
+            <wp:docPr id="1191575160" name="Grafik 1"/>
+            <wp:cNvGraphicFramePr>
+              <a:graphicFrameLocks xmlns:a="http://schemas.openxmlformats.org/drawingml/2006/main" noChangeAspect="1"/>
+            </wp:cNvGraphicFramePr>
+            <a:graphic xmlns:a="http://schemas.openxmlformats.org/drawingml/2006/main">
+              <a:graphicData uri="http://schemas.openxmlformats.org/drawingml/2006/picture">
+                <pic:pic xmlns:pic="http://schemas.openxmlformats.org/drawingml/2006/picture">
+                  <pic:nvPicPr>
+                    <pic:cNvPr id="1191575160" name=""/>
+                    <pic:cNvPicPr/>
+                  </pic:nvPicPr>
+                  <pic:blipFill>
+                    <a:blip r:embed="rId8">
+                      <a:extLst>
+                        <a:ext uri="{28A0092B-C50C-407E-A947-70E740481C1C}">
+                          <a14:useLocalDpi xmlns:a14="http://schemas.microsoft.com/office/drawing/2010/main" val="0"/>
+                        </a:ext>
+                      </a:extLst>
+                    </a:blip>
+                    <a:stretch>
+                      <a:fillRect/>
+                    </a:stretch>
+                  </pic:blipFill>
+                  <pic:spPr>
+                    <a:xfrm>
+                      <a:off x="0" y="0"/>
+                      <a:ext cx="3952875" cy="1628775"/>
+                    </a:xfrm>
+                    <a:prstGeom prst="rect">
+                      <a:avLst/>
+                    </a:prstGeom>
+                  </pic:spPr>
+                </pic:pic>
+              </a:graphicData>
+            </a:graphic>
+          </wp:anchor>
+        </w:drawing>
+      </w:r>
+      <w:r>
+        <w:rPr>
+          <w:rFonts w:ascii="INNIO" w:hAnsi="INNIO"/>
+          <w:b/>
+          <w:bCs/>
+          <w:color w:val="auto"/>
+        </w:rPr>
+        <w:t>Table 3- Rotating and oscillating masses</w:t>
+      </w:r>
+      <w:bookmarkEnd w:id="4"/>
+    </w:p>
+    <w:p>
+      <w:pPr>
+        <w:rPr>
+          <w:rFonts w:ascii="INNIO" w:hAnsi="INNIO"/>
+        </w:rPr>
+      </w:pPr>
+    </w:p>
+    <w:p>
+      <w:pPr>
+        <w:rPr>
+          <w:rFonts w:ascii="INNIO" w:hAnsi="INNIO"/>
+        </w:rPr>
+      </w:pPr>
+      <w:r>
+        <w:rPr>
+          <w:rFonts w:ascii="INNIO" w:hAnsi="INNIO"/>
+        </w:rPr>
+        <w:t xml:space="preserve">Table 3 contains </w:t>
+      </w:r>
+      <w:proofErr w:type="gramStart"/>
+      <w:r>
+        <w:rPr>
+          <w:rFonts w:ascii="INNIO" w:hAnsi="INNIO"/>
+        </w:rPr>
+        <w:t>the rotating</w:t>
+      </w:r>
+      <w:proofErr w:type="gramEnd"/>
+      <w:r>
+        <w:rPr>
+          <w:rFonts w:ascii="INNIO" w:hAnsi="INNIO"/>
+        </w:rPr>
+        <w:t xml:space="preserve"> and oscillating mass data, including piston mass, conrod masses, crank pin mass, web mass, and counterweight mass.</w:t>
+      </w:r>
+    </w:p>
+    <w:p>
+      <w:pPr>
+        <w:pStyle w:val="berschrift2"/>
+        <w:numPr>
+          <w:ilvl w:val="1"/>
+          <w:numId w:val="1"/>
+        </w:numPr>
+        <w:rPr>
+          <w:rFonts w:ascii="INNIO" w:hAnsi="INNIO"/>
+          <w:b/>
+          <w:bCs/>
+          <w:color w:val="auto"/>
+        </w:rPr>
+      </w:pPr>
+      <w:bookmarkStart w:id="5" w:name="_Toc237530168"/>
+      <w:r>
+        <w:rPr>
+          <w:rFonts w:ascii="INNIO" w:hAnsi="INNIO"/>
+          <w:b/>
+          <w:bCs/>
+          <w:color w:val="auto"/>
+        </w:rPr>
+        <w:t>Table 4- Throw angles</w:t>
+      </w:r>
+      <w:bookmarkEnd w:id="5"/>
+    </w:p>
+    <w:p>
+      <w:pPr>
+        <w:rPr>
+          <w:rFonts w:ascii="INNIO" w:hAnsi="INNIO"/>
+        </w:rPr>
+      </w:pPr>
+      <w:r>
+        <w:rPr>
+          <w:rFonts w:ascii="INNIO" w:hAnsi="INNIO"/>
+          <w:noProof/>
+        </w:rPr>
+        <w:drawing>
+          <wp:inline distT="0" distB="0" distL="0" distR="0" wp14:anchorId="71B0AB78" wp14:editId="46D87747">
+            <wp:extent cx="5760720" cy="1109980"/>
+            <wp:effectExtent l="0" t="0" r="0" b="0"/>
+            <wp:docPr id="1404786782" name="Grafik 1"/>
+            <wp:cNvGraphicFramePr>
+              <a:graphicFrameLocks xmlns:a="http://schemas.openxmlformats.org/drawingml/2006/main" noChangeAspect="1"/>
+            </wp:cNvGraphicFramePr>
+            <a:graphic xmlns:a="http://schemas.openxmlformats.org/drawingml/2006/main">
+              <a:graphicData uri="http://schemas.openxmlformats.org/drawingml/2006/picture">
+                <pic:pic xmlns:pic="http://schemas.openxmlformats.org/drawingml/2006/picture">
+                  <pic:nvPicPr>
+                    <pic:cNvPr id="1404786782" name=""/>
+                    <pic:cNvPicPr/>
+                  </pic:nvPicPr>
+                  <pic:blipFill>
+                    <a:blip r:embed="rId9"/>
+                    <a:stretch>
+                      <a:fillRect/>
+                    </a:stretch>
+                  </pic:blipFill>
+                  <pic:spPr>
+                    <a:xfrm>
+                      <a:off x="0" y="0"/>
+                      <a:ext cx="5760720" cy="1109980"/>
+                    </a:xfrm>
+                    <a:prstGeom prst="rect">
+                      <a:avLst/>
+                    </a:prstGeom>
+                  </pic:spPr>
+                </pic:pic>
+              </a:graphicData>
+            </a:graphic>
+          </wp:inline>
+        </w:drawing>
+      </w:r>
+    </w:p>
+    <w:p>
+      <w:pPr>
+        <w:rPr>
+          <w:rFonts w:ascii="INNIO" w:hAnsi="INNIO"/>
+        </w:rPr>
+      </w:pPr>
+      <w:r>
+        <w:rPr>
+          <w:rFonts w:ascii="INNIO" w:hAnsi="INNIO"/>
+        </w:rPr>
+        <w:t>Table 4 contains the crank throw angle combinations to be evaluated. Each row represents one case, and the corresponding throw angles define the crankshaft configuration for that case.</w:t>
+      </w:r>
+    </w:p>
+    <w:p>
+      <w:pPr>
+        <w:pStyle w:val="berschrift1"/>
+        <w:numPr>
+          <w:ilvl w:val="0"/>
+          <w:numId w:val="1"/>
+        </w:numPr>
+        <w:rPr>
+          <w:rFonts w:ascii="INNIO" w:hAnsi="INNIO"/>
+          <w:b/>
+          <w:bCs/>
+          <w:color w:val="auto"/>
+          <w:sz w:val="32"/>
+          <w:szCs w:val="32"/>
+        </w:rPr>
+      </w:pPr>
+      <w:bookmarkStart w:id="6" w:name="_Toc237530169"/>
+      <w:r>
+        <w:rPr>
+          <w:rFonts w:ascii="INNIO" w:hAnsi="INNIO"/>
+          <w:b/>
+          <w:bCs/>
+          <w:color w:val="auto"/>
+          <w:sz w:val="32"/>
+          <w:szCs w:val="32"/>
+        </w:rPr>
+        <w:t>How to Use the Tool</w:t>
+      </w:r>
+      <w:bookmarkEnd w:id="6"/>
+    </w:p>
+    <w:p>
+      <w:pPr>
+        <w:pStyle w:val="StandardWeb"/>
+        <w:shd w:val="clear" w:color="auto" w:fill="FFFFFF"/>
+        <w:rPr>
+          <w:rFonts w:ascii="INNIO" w:hAnsi="INNIO" w:cs="Segoe UI"/>
+          <w:lang w:val="en-US"/>
+        </w:rPr>
+      </w:pPr>
+      <w:r>
+        <w:rPr>
+          <w:rFonts w:ascii="INNIO" w:hAnsi="INNIO" w:cs="Segoe UI"/>
+          <w:lang w:val="en-US"/>
+        </w:rPr>
+        <w:t>To use the tool, upload the prepared Excel input file containing the required balancing data. After the file has been uploaded, the tool checks whether the expected sheet and table structure are available. Once the file is validated, click </w:t>
+      </w:r>
+      <w:r>
+        <w:rPr>
+          <w:rStyle w:val="Fett"/>
+          <w:rFonts w:ascii="INNIO" w:hAnsi="INNIO" w:cs="Segoe UI"/>
+          <w:lang w:val="en-US"/>
+        </w:rPr>
+        <w:t>Run Calculation</w:t>
+      </w:r>
+      <w:r>
+        <w:rPr>
+          <w:rFonts w:ascii="INNIO" w:hAnsi="INNIO" w:cs="Segoe UI"/>
+          <w:lang w:val="en-US"/>
+        </w:rPr>
+        <w:t> to start the balancing calculation. The results are then displayed in separate tabs for overview and detailed harmonic results.</w:t>
+      </w:r>
+    </w:p>
+    <w:p>
+      <w:pPr>
+        <w:rPr>
+          <w:rFonts w:ascii="INNIO" w:hAnsi="INNIO"/>
+        </w:rPr>
+      </w:pPr>
+    </w:p>
+    <w:p>
+      <w:pPr>
+        <w:pStyle w:val="berschrift1"/>
+        <w:numPr>
+          <w:ilvl w:val="0"/>
+          <w:numId w:val="1"/>
+        </w:numPr>
+        <w:rPr>
+          <w:rFonts w:ascii="INNIO" w:hAnsi="INNIO"/>
+          <w:b/>
+          <w:bCs/>
+          <w:color w:val="auto"/>
+          <w:sz w:val="32"/>
+          <w:szCs w:val="32"/>
+        </w:rPr>
+      </w:pPr>
+      <w:bookmarkStart w:id="7" w:name="_Toc237530170"/>
+      <w:r>
+        <w:rPr>
+          <w:rFonts w:ascii="INNIO" w:hAnsi="INNIO"/>
+          <w:b/>
+          <w:bCs/>
+          <w:color w:val="auto"/>
+          <w:sz w:val="32"/>
+          <w:szCs w:val="32"/>
+        </w:rPr>
+        <w:lastRenderedPageBreak/>
+        <w:t>Results</w:t>
+      </w:r>
+      <w:r>
+        <w:rPr>
+          <w:rFonts w:ascii="INNIO" w:hAnsi="INNIO"/>
+          <w:b/>
+          <w:bCs/>
+          <w:color w:val="auto"/>
+          <w:sz w:val="32"/>
+          <w:szCs w:val="32"/>
+        </w:rPr>
+        <w:t xml:space="preserve"> an</w:t>
+      </w:r>
+      <w:r>
+        <w:rPr>
+          <w:rFonts w:ascii="INNIO" w:hAnsi="INNIO"/>
+          <w:b/>
+          <w:bCs/>
+          <w:color w:val="auto"/>
+          <w:sz w:val="32"/>
+          <w:szCs w:val="32"/>
+        </w:rPr>
+        <w:t>d</w:t>
+      </w:r>
+      <w:r>
+        <w:rPr>
+          <w:rFonts w:ascii="INNIO" w:hAnsi="INNIO"/>
+          <w:b/>
+          <w:bCs/>
+          <w:color w:val="auto"/>
+          <w:sz w:val="32"/>
+          <w:szCs w:val="32"/>
+        </w:rPr>
+        <w:t xml:space="preserve"> Calculation</w:t>
+      </w:r>
+      <w:bookmarkEnd w:id="7"/>
+      <w:r>
+        <w:rPr>
+          <w:rFonts w:ascii="INNIO" w:hAnsi="INNIO"/>
+          <w:b/>
+          <w:bCs/>
+          <w:color w:val="auto"/>
+          <w:sz w:val="32"/>
+          <w:szCs w:val="32"/>
+        </w:rPr>
+        <w:t xml:space="preserve"> </w:t>
+      </w:r>
+      <w:r>
+        <w:rPr>
+          <w:rFonts w:ascii="INNIO" w:hAnsi="INNIO"/>
+          <w:b/>
+          <w:bCs/>
+          <w:color w:val="auto"/>
+          <w:sz w:val="32"/>
+          <w:szCs w:val="32"/>
+        </w:rPr>
+        <w:t xml:space="preserve"> </w:t>
+      </w:r>
+    </w:p>
+    <w:p>
+      <w:pPr>
+        <w:rPr>
+          <w:rFonts w:ascii="INNIO" w:hAnsi="INNIO"/>
+        </w:rPr>
+      </w:pPr>
+      <w:r>
+        <w:rPr>
+          <w:rFonts w:ascii="INNIO" w:hAnsi="INNIO"/>
+        </w:rPr>
+        <w:t>Formeln hier noch einfügen</w:t>
+      </w:r>
+      <w:r>
+        <w:rPr>
+          <w:rFonts w:ascii="INNIO" w:hAnsi="INNIO"/>
+        </w:rPr>
+        <w:t xml:space="preserve"> </w:t>
       </w:r>
     </w:p>
     <w:sectPr>
@@ -37,6 +1548,100 @@
     </w:sectPr>
   </w:body>
 </w:document>
+</file>
+
+<file path=word/numbering.xml><?xml version="1.0" encoding="utf-8"?>
+<w:numbering xmlns:wpc="http://schemas.microsoft.com/office/word/2010/wordprocessingCanvas" xmlns:cx="http://schemas.microsoft.com/office/drawing/2014/chartex" xmlns:cx1="http://schemas.microsoft.com/office/drawing/2015/9/8/chartex" xmlns:cx2="http://schemas.microsoft.com/office/drawing/2015/10/21/chartex" xmlns:cx3="http://schemas.microsoft.com/office/drawing/2016/5/9/chartex" xmlns:cx4="http://schemas.microsoft.com/office/drawing/2016/5/10/chartex" xmlns:cx5="http://schemas.microsoft.com/office/drawing/2016/5/11/chartex" xmlns:cx6="http://schemas.microsoft.com/office/drawing/2016/5/12/chartex" xmlns:cx7="http://schemas.microsoft.com/office/drawing/2016/5/13/chartex" xmlns:cx8="http://schemas.microsoft.com/office/drawing/2016/5/14/chartex" xmlns:mc="http://schemas.openxmlformats.org/markup-compatibility/2006" xmlns:aink="http://schemas.microsoft.com/office/drawing/2016/ink" xmlns:am3d="http://schemas.microsoft.com/office/drawing/2017/model3d" xmlns:o="urn:schemas-microsoft-com:office:office" xmlns:oel="http://schemas.microsoft.com/office/2019/extlst" xmlns:r="http://schemas.openxmlformats.org/officeDocument/2006/relationships" xmlns:m="http://schemas.openxmlformats.org/officeDocument/2006/math" xmlns:v="urn:schemas-microsoft-com:vml" xmlns:wp14="http://schemas.microsoft.com/office/word/2010/wordprocessingDrawing" xmlns:wp="http://schemas.openxmlformats.org/drawingml/2006/wordprocessingDrawing" xmlns:w10="urn:schemas-microsoft-com:office:word" xmlns:w="http://schemas.openxmlformats.org/wordprocessingml/2006/main" xmlns:w14="http://schemas.microsoft.com/office/word/2010/wordml" xmlns:w15="http://schemas.microsoft.com/office/word/2012/wordml" xmlns:w16cei="http://schemas.microsoft.com/office/word/2026/wordml/cei" xmlns:w16cex="http://schemas.microsoft.com/office/word/2018/wordml/cex" xmlns:w16cid="http://schemas.microsoft.com/office/word/2016/wordml/cid" xmlns:w16="http://schemas.microsoft.com/office/word/2018/wordml" xmlns:w16du="http://schemas.microsoft.com/office/word/2023/wordml/word16du" xmlns:w16sdtdh="http://schemas.microsoft.com/office/word/2020/wordml/sdtdatahash" xmlns:w16sdtfl="http://schemas.microsoft.com/office/word/2024/wordml/sdtformatlock" xmlns:w16se="http://schemas.microsoft.com/office/word/2015/wordml/symex" xmlns:wpg="http://schemas.microsoft.com/office/word/2010/wordprocessingGroup" xmlns:wpi="http://schemas.microsoft.com/office/word/2010/wordprocessingInk" xmlns:wne="http://schemas.microsoft.com/office/word/2006/wordml" xmlns:wps="http://schemas.microsoft.com/office/word/2010/wordprocessingShape" mc:Ignorable="w14 w15 w16se w16cid w16 w16cex w16sdtdh w16sdtfl w16du wp14">
+  <w:abstractNum w:abstractNumId="0" w15:restartNumberingAfterBreak="0">
+    <w:nsid w:val="50807FEC"/>
+    <w:multiLevelType w:val="multilevel"/>
+    <w:tmpl w:val="0C07001F"/>
+    <w:lvl w:ilvl="0">
+      <w:start w:val="1"/>
+      <w:numFmt w:val="decimal"/>
+      <w:lvlText w:val="%1."/>
+      <w:lvlJc w:val="left"/>
+      <w:pPr>
+        <w:ind w:left="360" w:hanging="360"/>
+      </w:pPr>
+    </w:lvl>
+    <w:lvl w:ilvl="1">
+      <w:start w:val="1"/>
+      <w:numFmt w:val="decimal"/>
+      <w:lvlText w:val="%1.%2."/>
+      <w:lvlJc w:val="left"/>
+      <w:pPr>
+        <w:ind w:left="792" w:hanging="432"/>
+      </w:pPr>
+    </w:lvl>
+    <w:lvl w:ilvl="2">
+      <w:start w:val="1"/>
+      <w:numFmt w:val="decimal"/>
+      <w:lvlText w:val="%1.%2.%3."/>
+      <w:lvlJc w:val="left"/>
+      <w:pPr>
+        <w:ind w:left="1224" w:hanging="504"/>
+      </w:pPr>
+    </w:lvl>
+    <w:lvl w:ilvl="3">
+      <w:start w:val="1"/>
+      <w:numFmt w:val="decimal"/>
+      <w:lvlText w:val="%1.%2.%3.%4."/>
+      <w:lvlJc w:val="left"/>
+      <w:pPr>
+        <w:ind w:left="1728" w:hanging="648"/>
+      </w:pPr>
+    </w:lvl>
+    <w:lvl w:ilvl="4">
+      <w:start w:val="1"/>
+      <w:numFmt w:val="decimal"/>
+      <w:lvlText w:val="%1.%2.%3.%4.%5."/>
+      <w:lvlJc w:val="left"/>
+      <w:pPr>
+        <w:ind w:left="2232" w:hanging="792"/>
+      </w:pPr>
+    </w:lvl>
+    <w:lvl w:ilvl="5">
+      <w:start w:val="1"/>
+      <w:numFmt w:val="decimal"/>
+      <w:lvlText w:val="%1.%2.%3.%4.%5.%6."/>
+      <w:lvlJc w:val="left"/>
+      <w:pPr>
+        <w:ind w:left="2736" w:hanging="936"/>
+      </w:pPr>
+    </w:lvl>
+    <w:lvl w:ilvl="6">
+      <w:start w:val="1"/>
+      <w:numFmt w:val="decimal"/>
+      <w:lvlText w:val="%1.%2.%3.%4.%5.%6.%7."/>
+      <w:lvlJc w:val="left"/>
+      <w:pPr>
+        <w:ind w:left="3240" w:hanging="1080"/>
+      </w:pPr>
+    </w:lvl>
+    <w:lvl w:ilvl="7">
+      <w:start w:val="1"/>
+      <w:numFmt w:val="decimal"/>
+      <w:lvlText w:val="%1.%2.%3.%4.%5.%6.%7.%8."/>
+      <w:lvlJc w:val="left"/>
+      <w:pPr>
+        <w:ind w:left="3744" w:hanging="1224"/>
+      </w:pPr>
+    </w:lvl>
+    <w:lvl w:ilvl="8">
+      <w:start w:val="1"/>
+      <w:numFmt w:val="decimal"/>
+      <w:lvlText w:val="%1.%2.%3.%4.%5.%6.%7.%8.%9."/>
+      <w:lvlJc w:val="left"/>
+      <w:pPr>
+        <w:ind w:left="4320" w:hanging="1440"/>
+      </w:pPr>
+    </w:lvl>
+  </w:abstractNum>
+  <w:num w:numId="1" w16cid:durableId="273560417">
+    <w:abstractNumId w:val="0"/>
+  </w:num>
+</w:numbering>
 </file>
 
 <file path=word/styles.xml><?xml version="1.0" encoding="utf-8"?>
@@ -439,6 +2044,9 @@
   <w:style w:type="paragraph" w:default="1" w:styleId="Standard">
     <w:name w:val="Normal"/>
     <w:qFormat/>
+    <w:rPr>
+      <w:lang w:val="en-US"/>
+    </w:rPr>
   </w:style>
   <w:style w:type="paragraph" w:styleId="berschrift1">
     <w:name w:val="heading 1"/>
@@ -467,7 +2075,6 @@
     <w:next w:val="Standard"/>
     <w:link w:val="berschrift2Zchn"/>
     <w:uiPriority w:val="9"/>
-    <w:semiHidden/>
     <w:unhideWhenUsed/>
     <w:qFormat/>
     <w:rsid w:val="00F02C6F"/>
@@ -684,7 +2291,6 @@
     <w:basedOn w:val="Absatz-Standardschriftart"/>
     <w:link w:val="berschrift2"/>
     <w:uiPriority w:val="9"/>
-    <w:semiHidden/>
     <w:rsid w:val="00F02C6F"/>
     <w:rPr>
       <w:rFonts w:asciiTheme="majorHAnsi" w:eastAsiaTheme="majorEastAsia" w:hAnsiTheme="majorHAnsi" w:cstheme="majorBidi"/>
@@ -954,6 +2560,110 @@
       <w:smallCaps/>
       <w:color w:val="0F4761" w:themeColor="accent1" w:themeShade="BF"/>
       <w:spacing w:val="5"/>
+    </w:rPr>
+  </w:style>
+  <w:style w:type="paragraph" w:customStyle="1" w:styleId="Formatvorlageusermanual">
+    <w:name w:val="Formatvorlage user manual"/>
+    <w:basedOn w:val="Standard"/>
+    <w:link w:val="FormatvorlageusermanualZchn"/>
+    <w:qFormat/>
+    <w:rsid w:val="00A530E7"/>
+    <w:rPr>
+      <w:rFonts w:ascii="INNIO" w:hAnsi="INNIO"/>
+    </w:rPr>
+  </w:style>
+  <w:style w:type="character" w:customStyle="1" w:styleId="FormatvorlageusermanualZchn">
+    <w:name w:val="Formatvorlage user manual Zchn"/>
+    <w:basedOn w:val="Absatz-Standardschriftart"/>
+    <w:link w:val="Formatvorlageusermanual"/>
+    <w:rsid w:val="00A530E7"/>
+    <w:rPr>
+      <w:rFonts w:ascii="INNIO" w:hAnsi="INNIO"/>
+      <w:lang w:val="en-US"/>
+    </w:rPr>
+  </w:style>
+  <w:style w:type="paragraph" w:styleId="Inhaltsverzeichnisberschrift">
+    <w:name w:val="TOC Heading"/>
+    <w:basedOn w:val="berschrift1"/>
+    <w:next w:val="Standard"/>
+    <w:uiPriority w:val="39"/>
+    <w:unhideWhenUsed/>
+    <w:qFormat/>
+    <w:rsid w:val="00A530E7"/>
+    <w:pPr>
+      <w:spacing w:before="240" w:after="0" w:line="259" w:lineRule="auto"/>
+      <w:outlineLvl w:val="9"/>
+    </w:pPr>
+    <w:rPr>
+      <w:kern w:val="0"/>
+      <w:sz w:val="32"/>
+      <w:szCs w:val="32"/>
+      <w:lang w:val="de-AT" w:eastAsia="de-AT"/>
+      <w14:ligatures w14:val="none"/>
+    </w:rPr>
+  </w:style>
+  <w:style w:type="paragraph" w:styleId="Verzeichnis1">
+    <w:name w:val="toc 1"/>
+    <w:basedOn w:val="Standard"/>
+    <w:next w:val="Standard"/>
+    <w:autoRedefine/>
+    <w:uiPriority w:val="39"/>
+    <w:unhideWhenUsed/>
+    <w:rsid w:val="00A530E7"/>
+    <w:pPr>
+      <w:spacing w:after="100"/>
+    </w:pPr>
+  </w:style>
+  <w:style w:type="character" w:styleId="Hyperlink">
+    <w:name w:val="Hyperlink"/>
+    <w:basedOn w:val="Absatz-Standardschriftart"/>
+    <w:uiPriority w:val="99"/>
+    <w:unhideWhenUsed/>
+    <w:rsid w:val="00A530E7"/>
+    <w:rPr>
+      <w:color w:val="467886" w:themeColor="hyperlink"/>
+      <w:u w:val="single"/>
+    </w:rPr>
+  </w:style>
+  <w:style w:type="paragraph" w:styleId="StandardWeb">
+    <w:name w:val="Normal (Web)"/>
+    <w:basedOn w:val="Standard"/>
+    <w:uiPriority w:val="99"/>
+    <w:semiHidden/>
+    <w:unhideWhenUsed/>
+    <w:rsid w:val="00D30541"/>
+    <w:pPr>
+      <w:spacing w:before="100" w:beforeAutospacing="1" w:after="100" w:afterAutospacing="1" w:line="240" w:lineRule="auto"/>
+    </w:pPr>
+    <w:rPr>
+      <w:rFonts w:ascii="Times New Roman" w:eastAsia="Times New Roman" w:hAnsi="Times New Roman" w:cs="Times New Roman"/>
+      <w:kern w:val="0"/>
+      <w:lang w:val="de-AT" w:eastAsia="de-AT"/>
+      <w14:ligatures w14:val="none"/>
+    </w:rPr>
+  </w:style>
+  <w:style w:type="paragraph" w:styleId="Verzeichnis2">
+    <w:name w:val="toc 2"/>
+    <w:basedOn w:val="Standard"/>
+    <w:next w:val="Standard"/>
+    <w:autoRedefine/>
+    <w:uiPriority w:val="39"/>
+    <w:unhideWhenUsed/>
+    <w:rsid w:val="000C4D26"/>
+    <w:pPr>
+      <w:spacing w:after="100"/>
+      <w:ind w:left="240"/>
+    </w:pPr>
+  </w:style>
+  <w:style w:type="character" w:styleId="Fett">
+    <w:name w:val="Strong"/>
+    <w:basedOn w:val="Absatz-Standardschriftart"/>
+    <w:uiPriority w:val="22"/>
+    <w:qFormat/>
+    <w:rsid w:val="002133AE"/>
+    <w:rPr>
+      <w:b/>
+      <w:bCs/>
     </w:rPr>
   </w:style>
 </w:styles>
@@ -1272,4 +2982,16 @@
     </a:ext>
   </a:extLst>
 </a:theme>
+</file>
+
+<file path=customXml/item1.xml><?xml version="1.0" encoding="utf-8"?>
+<b:Sources xmlns:b="http://schemas.openxmlformats.org/officeDocument/2006/bibliography" xmlns="http://schemas.openxmlformats.org/officeDocument/2006/bibliography" SelectedStyle="\APASixthEditionOfficeOnline.xsl" StyleName="APA" Version="6"/>
+</file>
+
+<file path=customXml/itemProps1.xml><?xml version="1.0" encoding="utf-8"?>
+<ds:datastoreItem xmlns:ds="http://schemas.openxmlformats.org/officeDocument/2006/customXml" ds:itemID="{76E66C72-FB51-4EEF-9584-26A82F49ED9B}">
+  <ds:schemaRefs>
+    <ds:schemaRef ds:uri="http://schemas.openxmlformats.org/officeDocument/2006/bibliography"/>
+  </ds:schemaRefs>
+</ds:datastoreItem>
 </file>
</xml_diff>